<commit_message>
Updated report with dataset snapshot date
</commit_message>
<xml_diff>
--- a/docs/report.docx
+++ b/docs/report.docx
@@ -73,27 +73,7 @@
             <w:sz w:val="24"/>
             <w:szCs w:val="24"/>
           </w:rPr>
-          <w:t>https://github.com/VismayCD/airbn</w:t>
-        </w:r>
-        <w:r>
-          <w:rPr>
-            <w:rStyle w:val="Hyperlink"/>
-            <w:b/>
-            <w:bCs/>
-            <w:sz w:val="24"/>
-            <w:szCs w:val="24"/>
-          </w:rPr>
-          <w:t>b</w:t>
-        </w:r>
-        <w:r>
-          <w:rPr>
-            <w:rStyle w:val="Hyperlink"/>
-            <w:b/>
-            <w:bCs/>
-            <w:sz w:val="24"/>
-            <w:szCs w:val="24"/>
-          </w:rPr>
-          <w:t>-price-prediction</w:t>
+          <w:t>https://github.com/VismayCD/airbnb-price-prediction</w:t>
         </w:r>
       </w:hyperlink>
     </w:p>
@@ -144,27 +124,7 @@
           <w:sz w:val="24"/>
           <w:szCs w:val="24"/>
         </w:rPr>
-        <w:t xml:space="preserve">Vishwas </w:t>
-      </w:r>
-      <w:proofErr w:type="spellStart"/>
-      <w:r>
-        <w:rPr>
-          <w:b/>
-          <w:bCs/>
-          <w:sz w:val="24"/>
-          <w:szCs w:val="24"/>
-        </w:rPr>
-        <w:t>Hosamath</w:t>
-      </w:r>
-      <w:proofErr w:type="spellEnd"/>
-      <w:r>
-        <w:rPr>
-          <w:b/>
-          <w:bCs/>
-          <w:sz w:val="24"/>
-          <w:szCs w:val="24"/>
-        </w:rPr>
-        <w:t xml:space="preserve"> (PES2UG24CS596)</w:t>
+        <w:t>Vishwas Hosamath (PES2UG24CS596)</w:t>
       </w:r>
     </w:p>
     <w:p>
@@ -243,23 +203,7 @@
           <w:sz w:val="22"/>
           <w:szCs w:val="22"/>
         </w:rPr>
-        <w:t>Nightly Airbnb prices are set by hosts by feel, which is hard for new hosts and opaque for guests. We predict the listing price from listing attributes in three cities and ask two questions: (</w:t>
-      </w:r>
-      <w:proofErr w:type="spellStart"/>
-      <w:r>
-        <w:rPr>
-          <w:sz w:val="22"/>
-          <w:szCs w:val="22"/>
-        </w:rPr>
-        <w:t>i</w:t>
-      </w:r>
-      <w:proofErr w:type="spellEnd"/>
-      <w:r>
-        <w:rPr>
-          <w:sz w:val="22"/>
-          <w:szCs w:val="22"/>
-        </w:rPr>
-        <w:t>) which regression methods and feature groups work best, and (ii) does a model trained on some cities transfer to an unseen one? The task follows Luo, Zhou and Zhou (2019); we re-implemented it independently and consulted the authors’ notebooks for reference.</w:t>
+        <w:t>Nightly Airbnb prices are set by hosts by feel, which is hard for new hosts and opaque for guests. We predict the listing price from listing attributes in three cities and ask two questions: (i) which regression methods and feature groups work best, and (ii) does a model trained on some cities transfer to an unseen one? The task follows Luo, Zhou and Zhou (2019); we re-implemented it independently and consulted the authors’ notebooks for reference.</w:t>
       </w:r>
     </w:p>
     <w:p>
@@ -324,7 +268,35 @@
           <w:sz w:val="22"/>
           <w:szCs w:val="22"/>
         </w:rPr>
-        <w:t xml:space="preserve"> listing tables for New York City, Paris and Berlin (snapshot 07-10-2026; 90 columns). Raw rows: NYC 30,259, Paris 77,679, Berlin 12,776. After removing listings with a missing or zero price and those above $500/night, </w:t>
+        <w:t xml:space="preserve"> listing tables for New York City, Paris and Berlin (snapshot </w:t>
+      </w:r>
+      <w:r>
+        <w:rPr>
+          <w:sz w:val="22"/>
+          <w:szCs w:val="22"/>
+        </w:rPr>
+        <w:t>23</w:t>
+      </w:r>
+      <w:r>
+        <w:rPr>
+          <w:sz w:val="22"/>
+          <w:szCs w:val="22"/>
+        </w:rPr>
+        <w:t>-</w:t>
+      </w:r>
+      <w:r>
+        <w:rPr>
+          <w:sz w:val="22"/>
+          <w:szCs w:val="22"/>
+        </w:rPr>
+        <w:t>06</w:t>
+      </w:r>
+      <w:r>
+        <w:rPr>
+          <w:sz w:val="22"/>
+          <w:szCs w:val="22"/>
+        </w:rPr>
+        <w:t xml:space="preserve">-2026; 90 columns). Raw rows: NYC 30,259, Paris 77,679, Berlin 12,776. After removing listings with a missing or zero price and those above $500/night, </w:t>
       </w:r>
       <w:r>
         <w:rPr>
@@ -340,25 +312,8 @@
           <w:sz w:val="22"/>
           <w:szCs w:val="22"/>
         </w:rPr>
-        <w:t xml:space="preserve"> remain (the label-transformation experiment keeps the uncapped data). Each city is split 7:2:1 into train/validation/test (seed 42); Berlin is used only as an unseen test city. Our snapshot is newer than the </w:t>
-      </w:r>
-      <w:proofErr w:type="gramStart"/>
-      <w:r>
-        <w:rPr>
-          <w:sz w:val="22"/>
-          <w:szCs w:val="22"/>
-        </w:rPr>
-        <w:t>paper’s</w:t>
-      </w:r>
-      <w:proofErr w:type="gramEnd"/>
-      <w:r>
-        <w:rPr>
-          <w:sz w:val="22"/>
-          <w:szCs w:val="22"/>
-        </w:rPr>
-        <w:t xml:space="preserve"> and lacks </w:t>
-      </w:r>
-      <w:proofErr w:type="spellStart"/>
+        <w:t xml:space="preserve"> remain (the label-transformation experiment keeps the uncapped data). Each city is split 7:2:1 into train/validation/test (seed 42); Berlin is used only as an unseen test city. Our snapshot is newer than the paper’s and lacks </w:t>
+      </w:r>
       <w:r>
         <w:rPr>
           <w:i/>
@@ -366,9 +321,15 @@
           <w:sz w:val="22"/>
           <w:szCs w:val="22"/>
         </w:rPr>
-        <w:t>security_deposit</w:t>
-      </w:r>
-      <w:proofErr w:type="spellEnd"/>
+        <w:t>security_deposit, cleaning_fee, guests_included, extra_people, summary, transit, house_rules</w:t>
+      </w:r>
+      <w:r>
+        <w:rPr>
+          <w:sz w:val="22"/>
+          <w:szCs w:val="22"/>
+        </w:rPr>
+        <w:t xml:space="preserve"> and several other text columns; </w:t>
+      </w:r>
       <w:r>
         <w:rPr>
           <w:i/>
@@ -376,9 +337,15 @@
           <w:sz w:val="22"/>
           <w:szCs w:val="22"/>
         </w:rPr>
-        <w:t xml:space="preserve">, </w:t>
-      </w:r>
-      <w:proofErr w:type="spellStart"/>
+        <w:t>instant_bookable, host_response_time, host_verifications, host_since</w:t>
+      </w:r>
+      <w:r>
+        <w:rPr>
+          <w:sz w:val="22"/>
+          <w:szCs w:val="22"/>
+        </w:rPr>
+        <w:t xml:space="preserve"> and </w:t>
+      </w:r>
       <w:r>
         <w:rPr>
           <w:i/>
@@ -386,165 +353,8 @@
           <w:sz w:val="22"/>
           <w:szCs w:val="22"/>
         </w:rPr>
-        <w:t>cleaning_fee</w:t>
-      </w:r>
-      <w:proofErr w:type="spellEnd"/>
-      <w:r>
-        <w:rPr>
-          <w:i/>
-          <w:iCs/>
-          <w:sz w:val="22"/>
-          <w:szCs w:val="22"/>
-        </w:rPr>
-        <w:t xml:space="preserve">, </w:t>
-      </w:r>
-      <w:proofErr w:type="spellStart"/>
-      <w:r>
-        <w:rPr>
-          <w:i/>
-          <w:iCs/>
-          <w:sz w:val="22"/>
-          <w:szCs w:val="22"/>
-        </w:rPr>
-        <w:t>guests_included</w:t>
-      </w:r>
-      <w:proofErr w:type="spellEnd"/>
-      <w:r>
-        <w:rPr>
-          <w:i/>
-          <w:iCs/>
-          <w:sz w:val="22"/>
-          <w:szCs w:val="22"/>
-        </w:rPr>
-        <w:t xml:space="preserve">, </w:t>
-      </w:r>
-      <w:proofErr w:type="spellStart"/>
-      <w:r>
-        <w:rPr>
-          <w:i/>
-          <w:iCs/>
-          <w:sz w:val="22"/>
-          <w:szCs w:val="22"/>
-        </w:rPr>
-        <w:t>extra_people</w:t>
-      </w:r>
-      <w:proofErr w:type="spellEnd"/>
-      <w:r>
-        <w:rPr>
-          <w:i/>
-          <w:iCs/>
-          <w:sz w:val="22"/>
-          <w:szCs w:val="22"/>
-        </w:rPr>
-        <w:t xml:space="preserve">, summary, transit, </w:t>
-      </w:r>
-      <w:proofErr w:type="spellStart"/>
-      <w:r>
-        <w:rPr>
-          <w:i/>
-          <w:iCs/>
-          <w:sz w:val="22"/>
-          <w:szCs w:val="22"/>
-        </w:rPr>
-        <w:t>house_rules</w:t>
-      </w:r>
-      <w:proofErr w:type="spellEnd"/>
-      <w:r>
-        <w:rPr>
-          <w:sz w:val="22"/>
-          <w:szCs w:val="22"/>
-        </w:rPr>
-        <w:t xml:space="preserve"> and several other text columns; </w:t>
-      </w:r>
-      <w:proofErr w:type="spellStart"/>
-      <w:r>
-        <w:rPr>
-          <w:i/>
-          <w:iCs/>
-          <w:sz w:val="22"/>
-          <w:szCs w:val="22"/>
-        </w:rPr>
-        <w:t>instant_bookable</w:t>
-      </w:r>
-      <w:proofErr w:type="spellEnd"/>
-      <w:r>
-        <w:rPr>
-          <w:i/>
-          <w:iCs/>
-          <w:sz w:val="22"/>
-          <w:szCs w:val="22"/>
-        </w:rPr>
-        <w:t xml:space="preserve">, </w:t>
-      </w:r>
-      <w:proofErr w:type="spellStart"/>
-      <w:r>
-        <w:rPr>
-          <w:i/>
-          <w:iCs/>
-          <w:sz w:val="22"/>
-          <w:szCs w:val="22"/>
-        </w:rPr>
-        <w:t>host_response_time</w:t>
-      </w:r>
-      <w:proofErr w:type="spellEnd"/>
-      <w:r>
-        <w:rPr>
-          <w:i/>
-          <w:iCs/>
-          <w:sz w:val="22"/>
-          <w:szCs w:val="22"/>
-        </w:rPr>
-        <w:t xml:space="preserve">, </w:t>
-      </w:r>
-      <w:proofErr w:type="spellStart"/>
-      <w:r>
-        <w:rPr>
-          <w:i/>
-          <w:iCs/>
-          <w:sz w:val="22"/>
-          <w:szCs w:val="22"/>
-        </w:rPr>
-        <w:t>host_verifications</w:t>
-      </w:r>
-      <w:proofErr w:type="spellEnd"/>
-      <w:r>
-        <w:rPr>
-          <w:i/>
-          <w:iCs/>
-          <w:sz w:val="22"/>
-          <w:szCs w:val="22"/>
-        </w:rPr>
-        <w:t xml:space="preserve">, </w:t>
-      </w:r>
-      <w:proofErr w:type="spellStart"/>
-      <w:r>
-        <w:rPr>
-          <w:i/>
-          <w:iCs/>
-          <w:sz w:val="22"/>
-          <w:szCs w:val="22"/>
-        </w:rPr>
-        <w:t>host_since</w:t>
-      </w:r>
-      <w:proofErr w:type="spellEnd"/>
-      <w:r>
-        <w:rPr>
-          <w:sz w:val="22"/>
-          <w:szCs w:val="22"/>
-        </w:rPr>
-        <w:t xml:space="preserve"> and </w:t>
-      </w:r>
-      <w:proofErr w:type="spellStart"/>
-      <w:r>
-        <w:rPr>
-          <w:i/>
-          <w:iCs/>
-          <w:sz w:val="22"/>
-          <w:szCs w:val="22"/>
-        </w:rPr>
         <w:t>neighborhood_overview</w:t>
       </w:r>
-      <w:proofErr w:type="spellEnd"/>
       <w:r>
         <w:rPr>
           <w:sz w:val="22"/>
@@ -663,23 +473,7 @@
           <w:sz w:val="22"/>
           <w:szCs w:val="22"/>
         </w:rPr>
-        <w:t xml:space="preserve"> one-hot </w:t>
-      </w:r>
-      <w:proofErr w:type="spellStart"/>
-      <w:r>
-        <w:rPr>
-          <w:sz w:val="22"/>
-          <w:szCs w:val="22"/>
-        </w:rPr>
-        <w:t>categoricals</w:t>
-      </w:r>
-      <w:proofErr w:type="spellEnd"/>
-      <w:r>
-        <w:rPr>
-          <w:sz w:val="22"/>
-          <w:szCs w:val="22"/>
-        </w:rPr>
-        <w:t xml:space="preserve"> plus multi-hot amenities (top 50), 339 columns for NYC; </w:t>
+        <w:t xml:space="preserve"> one-hot categoricals plus multi-hot amenities (top 50), 339 columns for NYC; </w:t>
       </w:r>
       <w:r>
         <w:rPr>
@@ -695,23 +489,7 @@
           <w:sz w:val="22"/>
           <w:szCs w:val="22"/>
         </w:rPr>
-        <w:t xml:space="preserve"> TF-IDF (</w:t>
-      </w:r>
-      <w:proofErr w:type="spellStart"/>
-      <w:r>
-        <w:rPr>
-          <w:sz w:val="22"/>
-          <w:szCs w:val="22"/>
-        </w:rPr>
-        <w:t>uni+bigrams</w:t>
-      </w:r>
-      <w:proofErr w:type="spellEnd"/>
-      <w:r>
-        <w:rPr>
-          <w:sz w:val="22"/>
-          <w:szCs w:val="22"/>
-        </w:rPr>
-        <w:t xml:space="preserve">) of </w:t>
+        <w:t xml:space="preserve"> TF-IDF (uni+bigrams) of </w:t>
       </w:r>
       <w:r>
         <w:rPr>
@@ -720,19 +498,8 @@
           <w:sz w:val="22"/>
           <w:szCs w:val="22"/>
         </w:rPr>
-        <w:t xml:space="preserve">name, description, </w:t>
-      </w:r>
-      <w:proofErr w:type="spellStart"/>
-      <w:r>
-        <w:rPr>
-          <w:i/>
-          <w:iCs/>
-          <w:sz w:val="22"/>
-          <w:szCs w:val="22"/>
-        </w:rPr>
-        <w:t>host_about</w:t>
-      </w:r>
-      <w:proofErr w:type="spellEnd"/>
+        <w:t>name, description, host_about</w:t>
+      </w:r>
       <w:r>
         <w:rPr>
           <w:sz w:val="22"/>
@@ -786,71 +553,7 @@
           <w:sz w:val="22"/>
           <w:szCs w:val="22"/>
         </w:rPr>
-        <w:t xml:space="preserve"> Ridge, KNN (k=5), Random Forest (100 trees), </w:t>
-      </w:r>
-      <w:proofErr w:type="spellStart"/>
-      <w:r>
-        <w:rPr>
-          <w:sz w:val="22"/>
-          <w:szCs w:val="22"/>
-        </w:rPr>
-        <w:t>XGBoost</w:t>
-      </w:r>
-      <w:proofErr w:type="spellEnd"/>
-      <w:r>
-        <w:rPr>
-          <w:sz w:val="22"/>
-          <w:szCs w:val="22"/>
-        </w:rPr>
-        <w:t xml:space="preserve"> (300 trees, depth 6), and two neural networks: an </w:t>
-      </w:r>
-      <w:proofErr w:type="spellStart"/>
-      <w:r>
-        <w:rPr>
-          <w:sz w:val="22"/>
-          <w:szCs w:val="22"/>
-        </w:rPr>
-        <w:t>SGD+Nesterov</w:t>
-      </w:r>
-      <w:proofErr w:type="spellEnd"/>
-      <w:r>
-        <w:rPr>
-          <w:sz w:val="22"/>
-          <w:szCs w:val="22"/>
-        </w:rPr>
-        <w:t xml:space="preserve"> MLP (64-32, </w:t>
-      </w:r>
-      <w:proofErr w:type="spellStart"/>
-      <w:r>
-        <w:rPr>
-          <w:sz w:val="22"/>
-          <w:szCs w:val="22"/>
-        </w:rPr>
-        <w:t>lr</w:t>
-      </w:r>
-      <w:proofErr w:type="spellEnd"/>
-      <w:r>
-        <w:rPr>
-          <w:sz w:val="22"/>
-          <w:szCs w:val="22"/>
-        </w:rPr>
-        <w:t xml:space="preserve"> 0.005, L2 0.005, early stopping) and an Adam MLP (128-512-64, </w:t>
-      </w:r>
-      <w:proofErr w:type="spellStart"/>
-      <w:r>
-        <w:rPr>
-          <w:sz w:val="22"/>
-          <w:szCs w:val="22"/>
-        </w:rPr>
-        <w:t>lr</w:t>
-      </w:r>
-      <w:proofErr w:type="spellEnd"/>
-      <w:r>
-        <w:rPr>
-          <w:sz w:val="22"/>
-          <w:szCs w:val="22"/>
-        </w:rPr>
-        <w:t xml:space="preserve"> 1e-4, weight decay 1e-5). </w:t>
+        <w:t xml:space="preserve"> Ridge, KNN (k=5), Random Forest (100 trees), XGBoost (300 trees, depth 6), and two neural networks: an SGD+Nesterov MLP (64-32, lr 0.005, L2 0.005, early stopping) and an Adam MLP (128-512-64, lr 1e-4, weight decay 1e-5). </w:t>
       </w:r>
       <w:r>
         <w:rPr>
@@ -892,23 +595,7 @@
           <w:sz w:val="22"/>
           <w:szCs w:val="22"/>
         </w:rPr>
-        <w:t xml:space="preserve"> A neural network (C+O features, log label) is trained on NYC, Paris, or </w:t>
-      </w:r>
-      <w:proofErr w:type="spellStart"/>
-      <w:r>
-        <w:rPr>
-          <w:sz w:val="22"/>
-          <w:szCs w:val="22"/>
-        </w:rPr>
-        <w:t>NYC+Paris</w:t>
-      </w:r>
-      <w:proofErr w:type="spellEnd"/>
-      <w:r>
-        <w:rPr>
-          <w:sz w:val="22"/>
-          <w:szCs w:val="22"/>
-        </w:rPr>
-        <w:t xml:space="preserve"> and tested on Berlin under three preprocessing variants: </w:t>
+        <w:t xml:space="preserve"> A neural network (C+O features, log label) is trained on NYC, Paris, or NYC+Paris and tested on Berlin under three preprocessing variants: </w:t>
       </w:r>
       <w:r>
         <w:rPr>
@@ -942,7 +629,6 @@
         </w:rPr>
         <w:t xml:space="preserve"> (log1p on heavy-tailed counts and clip standardised values to ±5σ) and </w:t>
       </w:r>
-      <w:proofErr w:type="spellStart"/>
       <w:r>
         <w:rPr>
           <w:b/>
@@ -952,7 +638,6 @@
         </w:rPr>
         <w:t>robust+relgeo</w:t>
       </w:r>
-      <w:proofErr w:type="spellEnd"/>
       <w:r>
         <w:rPr>
           <w:sz w:val="22"/>
@@ -1025,7 +710,6 @@
         </w:rPr>
         <w:t xml:space="preserve">) implements </w:t>
       </w:r>
-      <w:proofErr w:type="spellStart"/>
       <w:r>
         <w:rPr>
           <w:i/>
@@ -1035,7 +719,6 @@
         </w:rPr>
         <w:t>load_city</w:t>
       </w:r>
-      <w:proofErr w:type="spellEnd"/>
       <w:r>
         <w:rPr>
           <w:sz w:val="22"/>
@@ -1043,7 +726,6 @@
         </w:rPr>
         <w:t xml:space="preserve"> (price parsing, cleaning, cap) → </w:t>
       </w:r>
-      <w:proofErr w:type="spellStart"/>
       <w:r>
         <w:rPr>
           <w:i/>
@@ -1053,7 +735,6 @@
         </w:rPr>
         <w:t>split_city</w:t>
       </w:r>
-      <w:proofErr w:type="spellEnd"/>
       <w:r>
         <w:rPr>
           <w:sz w:val="22"/>
@@ -1061,7 +742,6 @@
         </w:rPr>
         <w:t xml:space="preserve"> → </w:t>
       </w:r>
-      <w:proofErr w:type="spellStart"/>
       <w:r>
         <w:rPr>
           <w:i/>
@@ -1071,31 +751,13 @@
         </w:rPr>
         <w:t>FeatureBuilder</w:t>
       </w:r>
-      <w:proofErr w:type="spellEnd"/>
-      <w:r>
-        <w:rPr>
-          <w:sz w:val="22"/>
-          <w:szCs w:val="22"/>
-        </w:rPr>
-        <w:t xml:space="preserve"> (fit/transform; missing columns become </w:t>
-      </w:r>
-      <w:proofErr w:type="spellStart"/>
-      <w:r>
-        <w:rPr>
-          <w:sz w:val="22"/>
-          <w:szCs w:val="22"/>
-        </w:rPr>
-        <w:t>NaN</w:t>
-      </w:r>
-      <w:proofErr w:type="spellEnd"/>
-      <w:r>
-        <w:rPr>
-          <w:sz w:val="22"/>
-          <w:szCs w:val="22"/>
-        </w:rPr>
-        <w:t xml:space="preserve"> so cities with different schemas can share one pipeline) → </w:t>
-      </w:r>
-      <w:proofErr w:type="spellStart"/>
+      <w:r>
+        <w:rPr>
+          <w:sz w:val="22"/>
+          <w:szCs w:val="22"/>
+        </w:rPr>
+        <w:t xml:space="preserve"> (fit/transform; missing columns become NaN so cities with different schemas can share one pipeline) → </w:t>
+      </w:r>
       <w:r>
         <w:rPr>
           <w:i/>
@@ -1105,7 +767,6 @@
         </w:rPr>
         <w:t>make_model</w:t>
       </w:r>
-      <w:proofErr w:type="spellEnd"/>
       <w:r>
         <w:rPr>
           <w:sz w:val="22"/>
@@ -1113,7 +774,6 @@
         </w:rPr>
         <w:t xml:space="preserve"> → </w:t>
       </w:r>
-      <w:proofErr w:type="spellStart"/>
       <w:r>
         <w:rPr>
           <w:i/>
@@ -1123,7 +783,6 @@
         </w:rPr>
         <w:t>run_experiment</w:t>
       </w:r>
-      <w:proofErr w:type="spellEnd"/>
       <w:r>
         <w:rPr>
           <w:sz w:val="22"/>
@@ -1161,23 +820,7 @@
           <w:sz w:val="22"/>
           <w:szCs w:val="22"/>
         </w:rPr>
-        <w:t xml:space="preserve">. Compared with the authors’ notebooks we fit TF-IDF/SVD/encoders on the training split only (they fit on all rows), added the Adam network to mirror their </w:t>
-      </w:r>
-      <w:proofErr w:type="spellStart"/>
-      <w:r>
-        <w:rPr>
-          <w:sz w:val="22"/>
-          <w:szCs w:val="22"/>
-        </w:rPr>
-        <w:t>PyTorch</w:t>
-      </w:r>
-      <w:proofErr w:type="spellEnd"/>
-      <w:r>
-        <w:rPr>
-          <w:sz w:val="22"/>
-          <w:szCs w:val="22"/>
-        </w:rPr>
-        <w:t xml:space="preserve"> model, and added the robust/relative-coordinate variants and diagnostics.</w:t>
+        <w:t>. Compared with the authors’ notebooks we fit TF-IDF/SVD/encoders on the training split only (they fit on all rows), added the Adam network to mirror their PyTorch model, and added the robust/relative-coordinate variants and diagnostics.</w:t>
       </w:r>
     </w:p>
     <w:p>
@@ -1292,12 +935,6 @@
         <w:gridCol w:w="1006"/>
       </w:tblGrid>
       <w:tr>
-        <w:tblPrEx>
-          <w:tblCellMar>
-            <w:top w:w="0" w:type="dxa"/>
-            <w:bottom w:w="0" w:type="dxa"/>
-          </w:tblCellMar>
-        </w:tblPrEx>
         <w:trPr>
           <w:tblHeader/>
         </w:trPr>
@@ -1511,7 +1148,6 @@
             <w:pPr>
               <w:jc w:val="center"/>
             </w:pPr>
-            <w:proofErr w:type="spellStart"/>
             <w:r>
               <w:rPr>
                 <w:b/>
@@ -1521,17 +1157,10 @@
               </w:rPr>
               <w:t>XGBoost</w:t>
             </w:r>
-            <w:proofErr w:type="spellEnd"/>
           </w:p>
         </w:tc>
       </w:tr>
       <w:tr>
-        <w:tblPrEx>
-          <w:tblCellMar>
-            <w:top w:w="0" w:type="dxa"/>
-            <w:bottom w:w="0" w:type="dxa"/>
-          </w:tblCellMar>
-        </w:tblPrEx>
         <w:tc>
           <w:tcPr>
             <w:tcW w:w="1300" w:type="dxa"/>
@@ -1734,12 +1363,6 @@
         </w:tc>
       </w:tr>
       <w:tr>
-        <w:tblPrEx>
-          <w:tblCellMar>
-            <w:top w:w="0" w:type="dxa"/>
-            <w:bottom w:w="0" w:type="dxa"/>
-          </w:tblCellMar>
-        </w:tblPrEx>
         <w:tc>
           <w:tcPr>
             <w:tcW w:w="1300" w:type="dxa"/>
@@ -1956,12 +1579,6 @@
         </w:tc>
       </w:tr>
       <w:tr>
-        <w:tblPrEx>
-          <w:tblCellMar>
-            <w:top w:w="0" w:type="dxa"/>
-            <w:bottom w:w="0" w:type="dxa"/>
-          </w:tblCellMar>
-        </w:tblPrEx>
         <w:tc>
           <w:tcPr>
             <w:tcW w:w="1300" w:type="dxa"/>
@@ -2193,23 +1810,7 @@
           <w:b/>
           <w:bCs/>
         </w:rPr>
-        <w:t xml:space="preserve">Table 2 – </w:t>
-      </w:r>
-      <w:proofErr w:type="spellStart"/>
-      <w:r>
-        <w:rPr>
-          <w:b/>
-          <w:bCs/>
-        </w:rPr>
-        <w:t>XGBoost</w:t>
-      </w:r>
-      <w:proofErr w:type="spellEnd"/>
-      <w:r>
-        <w:rPr>
-          <w:b/>
-          <w:bCs/>
-        </w:rPr>
-        <w:t xml:space="preserve"> test R² by label transform and feature group.</w:t>
+        <w:t>Table 2 – XGBoost test R² by label transform and feature group.</w:t>
       </w:r>
     </w:p>
     <w:tbl>
@@ -2237,12 +1838,6 @@
         <w:gridCol w:w="2206"/>
       </w:tblGrid>
       <w:tr>
-        <w:tblPrEx>
-          <w:tblCellMar>
-            <w:top w:w="0" w:type="dxa"/>
-            <w:bottom w:w="0" w:type="dxa"/>
-          </w:tblCellMar>
-        </w:tblPrEx>
         <w:trPr>
           <w:tblHeader/>
         </w:trPr>
@@ -2405,12 +2000,6 @@
         </w:tc>
       </w:tr>
       <w:tr>
-        <w:tblPrEx>
-          <w:tblCellMar>
-            <w:top w:w="0" w:type="dxa"/>
-            <w:bottom w:w="0" w:type="dxa"/>
-          </w:tblCellMar>
-        </w:tblPrEx>
         <w:tc>
           <w:tcPr>
             <w:tcW w:w="3200" w:type="dxa"/>
@@ -2587,12 +2176,6 @@
         <w:gridCol w:w="2406"/>
       </w:tblGrid>
       <w:tr>
-        <w:tblPrEx>
-          <w:tblCellMar>
-            <w:top w:w="0" w:type="dxa"/>
-            <w:bottom w:w="0" w:type="dxa"/>
-          </w:tblCellMar>
-        </w:tblPrEx>
         <w:trPr>
           <w:tblHeader/>
         </w:trPr>
@@ -2819,12 +2402,6 @@
         </w:tc>
       </w:tr>
       <w:tr>
-        <w:tblPrEx>
-          <w:tblCellMar>
-            <w:top w:w="0" w:type="dxa"/>
-            <w:bottom w:w="0" w:type="dxa"/>
-          </w:tblCellMar>
-        </w:tblPrEx>
         <w:tc>
           <w:tcPr>
             <w:tcW w:w="1500" w:type="dxa"/>
@@ -3088,12 +2665,6 @@
         <w:gridCol w:w="2106"/>
       </w:tblGrid>
       <w:tr>
-        <w:tblPrEx>
-          <w:tblCellMar>
-            <w:top w:w="0" w:type="dxa"/>
-            <w:bottom w:w="0" w:type="dxa"/>
-          </w:tblCellMar>
-        </w:tblPrEx>
         <w:trPr>
           <w:tblHeader/>
         </w:trPr>
@@ -3288,12 +2859,6 @@
         </w:tc>
       </w:tr>
       <w:tr>
-        <w:tblPrEx>
-          <w:tblCellMar>
-            <w:top w:w="0" w:type="dxa"/>
-            <w:bottom w:w="0" w:type="dxa"/>
-          </w:tblCellMar>
-        </w:tblPrEx>
         <w:tc>
           <w:tcPr>
             <w:tcW w:w="1500" w:type="dxa"/>
@@ -3467,12 +3032,6 @@
         </w:tc>
       </w:tr>
       <w:tr>
-        <w:tblPrEx>
-          <w:tblCellMar>
-            <w:top w:w="0" w:type="dxa"/>
-            <w:bottom w:w="0" w:type="dxa"/>
-          </w:tblCellMar>
-        </w:tblPrEx>
         <w:tc>
           <w:tcPr>
             <w:tcW w:w="1500" w:type="dxa"/>
@@ -3646,12 +3205,6 @@
         </w:tc>
       </w:tr>
       <w:tr>
-        <w:tblPrEx>
-          <w:tblCellMar>
-            <w:top w:w="0" w:type="dxa"/>
-            <w:bottom w:w="0" w:type="dxa"/>
-          </w:tblCellMar>
-        </w:tblPrEx>
         <w:tc>
           <w:tcPr>
             <w:tcW w:w="1500" w:type="dxa"/>
@@ -3669,7 +3222,6 @@
             </w:tcMar>
           </w:tcPr>
           <w:p>
-            <w:proofErr w:type="spellStart"/>
             <w:r>
               <w:rPr>
                 <w:sz w:val="16"/>
@@ -3677,7 +3229,6 @@
               </w:rPr>
               <w:t>NYC+Paris</w:t>
             </w:r>
-            <w:proofErr w:type="spellEnd"/>
           </w:p>
         </w:tc>
         <w:tc>
@@ -3827,12 +3378,6 @@
         </w:tc>
       </w:tr>
       <w:tr>
-        <w:tblPrEx>
-          <w:tblCellMar>
-            <w:top w:w="0" w:type="dxa"/>
-            <w:bottom w:w="0" w:type="dxa"/>
-          </w:tblCellMar>
-        </w:tblPrEx>
         <w:tc>
           <w:tcPr>
             <w:tcW w:w="1500" w:type="dxa"/>
@@ -4006,12 +3551,6 @@
         </w:tc>
       </w:tr>
       <w:tr>
-        <w:tblPrEx>
-          <w:tblCellMar>
-            <w:top w:w="0" w:type="dxa"/>
-            <w:bottom w:w="0" w:type="dxa"/>
-          </w:tblCellMar>
-        </w:tblPrEx>
         <w:tc>
           <w:tcPr>
             <w:tcW w:w="1500" w:type="dxa"/>
@@ -4185,12 +3724,6 @@
         </w:tc>
       </w:tr>
       <w:tr>
-        <w:tblPrEx>
-          <w:tblCellMar>
-            <w:top w:w="0" w:type="dxa"/>
-            <w:bottom w:w="0" w:type="dxa"/>
-          </w:tblCellMar>
-        </w:tblPrEx>
         <w:tc>
           <w:tcPr>
             <w:tcW w:w="1500" w:type="dxa"/>
@@ -4208,7 +3741,6 @@
             </w:tcMar>
           </w:tcPr>
           <w:p>
-            <w:proofErr w:type="spellStart"/>
             <w:r>
               <w:rPr>
                 <w:sz w:val="16"/>
@@ -4216,7 +3748,6 @@
               </w:rPr>
               <w:t>NYC+Paris</w:t>
             </w:r>
-            <w:proofErr w:type="spellEnd"/>
           </w:p>
         </w:tc>
         <w:tc>
@@ -4366,12 +3897,6 @@
         </w:tc>
       </w:tr>
       <w:tr>
-        <w:tblPrEx>
-          <w:tblCellMar>
-            <w:top w:w="0" w:type="dxa"/>
-            <w:bottom w:w="0" w:type="dxa"/>
-          </w:tblCellMar>
-        </w:tblPrEx>
         <w:tc>
           <w:tcPr>
             <w:tcW w:w="1500" w:type="dxa"/>
@@ -4418,7 +3943,6 @@
             <w:pPr>
               <w:jc w:val="center"/>
             </w:pPr>
-            <w:proofErr w:type="spellStart"/>
             <w:r>
               <w:rPr>
                 <w:sz w:val="16"/>
@@ -4426,7 +3950,6 @@
               </w:rPr>
               <w:t>robust+relgeo</w:t>
             </w:r>
-            <w:proofErr w:type="spellEnd"/>
           </w:p>
         </w:tc>
         <w:tc>
@@ -4547,12 +4070,6 @@
         </w:tc>
       </w:tr>
       <w:tr>
-        <w:tblPrEx>
-          <w:tblCellMar>
-            <w:top w:w="0" w:type="dxa"/>
-            <w:bottom w:w="0" w:type="dxa"/>
-          </w:tblCellMar>
-        </w:tblPrEx>
         <w:tc>
           <w:tcPr>
             <w:tcW w:w="1500" w:type="dxa"/>
@@ -4599,7 +4116,6 @@
             <w:pPr>
               <w:jc w:val="center"/>
             </w:pPr>
-            <w:proofErr w:type="spellStart"/>
             <w:r>
               <w:rPr>
                 <w:sz w:val="16"/>
@@ -4607,7 +4123,6 @@
               </w:rPr>
               <w:t>robust+relgeo</w:t>
             </w:r>
-            <w:proofErr w:type="spellEnd"/>
           </w:p>
         </w:tc>
         <w:tc>
@@ -4728,12 +4243,6 @@
         </w:tc>
       </w:tr>
       <w:tr>
-        <w:tblPrEx>
-          <w:tblCellMar>
-            <w:top w:w="0" w:type="dxa"/>
-            <w:bottom w:w="0" w:type="dxa"/>
-          </w:tblCellMar>
-        </w:tblPrEx>
         <w:tc>
           <w:tcPr>
             <w:tcW w:w="1500" w:type="dxa"/>
@@ -4751,7 +4260,6 @@
             </w:tcMar>
           </w:tcPr>
           <w:p>
-            <w:proofErr w:type="spellStart"/>
             <w:r>
               <w:rPr>
                 <w:sz w:val="16"/>
@@ -4759,7 +4267,6 @@
               </w:rPr>
               <w:t>NYC+Paris</w:t>
             </w:r>
-            <w:proofErr w:type="spellEnd"/>
           </w:p>
         </w:tc>
         <w:tc>
@@ -4782,7 +4289,6 @@
             <w:pPr>
               <w:jc w:val="center"/>
             </w:pPr>
-            <w:proofErr w:type="spellStart"/>
             <w:r>
               <w:rPr>
                 <w:sz w:val="16"/>
@@ -4790,7 +4296,6 @@
               </w:rPr>
               <w:t>robust+relgeo</w:t>
             </w:r>
-            <w:proofErr w:type="spellEnd"/>
           </w:p>
         </w:tc>
         <w:tc>
@@ -5041,23 +4546,7 @@
           <w:sz w:val="22"/>
           <w:szCs w:val="22"/>
         </w:rPr>
-        <w:t xml:space="preserve"> </w:t>
-      </w:r>
-      <w:proofErr w:type="spellStart"/>
-      <w:r>
-        <w:rPr>
-          <w:sz w:val="22"/>
-          <w:szCs w:val="22"/>
-        </w:rPr>
-        <w:t>XGBoost</w:t>
-      </w:r>
-      <w:proofErr w:type="spellEnd"/>
-      <w:r>
-        <w:rPr>
-          <w:sz w:val="22"/>
-          <w:szCs w:val="22"/>
-        </w:rPr>
-        <w:t xml:space="preserve"> (test R² 0.740) &gt; Random Forest (0.717) &gt; neural networks (0.666 / 0.686) &gt; KNN (0.607) &gt; Ridge (0.446). Forests overfit most (train 0.960 vs test 0.717).</w:t>
+        <w:t xml:space="preserve"> XGBoost (test R² 0.740) &gt; Random Forest (0.717) &gt; neural networks (0.666 / 0.686) &gt; KNN (0.607) &gt; Ridge (0.446). Forests overfit most (train 0.960 vs test 0.717).</w:t>
       </w:r>
     </w:p>
     <w:p>
@@ -5121,7 +4610,6 @@
         </w:rPr>
         <w:t xml:space="preserve"> With training-city standardisation, Berlin coordinates and extreme </w:t>
       </w:r>
-      <w:proofErr w:type="spellStart"/>
       <w:r>
         <w:rPr>
           <w:i/>
@@ -5131,7 +4619,6 @@
         </w:rPr>
         <w:t>maximum_nights</w:t>
       </w:r>
-      <w:proofErr w:type="spellEnd"/>
       <w:r>
         <w:rPr>
           <w:sz w:val="22"/>
@@ -5168,39 +4655,7 @@
           <w:sz w:val="22"/>
           <w:szCs w:val="22"/>
         </w:rPr>
-        <w:t xml:space="preserve"> Berlin Spearman is 0.79–0.88 for the non-diverged variants, close to in-city values, while the bias reflects city price levels (NYC-trained relative-coordinate model over-predicts Berlin by about 0.80 log units, roughly 2.2×). Calibrating with only 100 Berlin listings lifts R² to 0.71–0.84; for NYC to Berlin with relative </w:t>
-      </w:r>
-      <w:proofErr w:type="gramStart"/>
-      <w:r>
-        <w:rPr>
-          <w:sz w:val="22"/>
-          <w:szCs w:val="22"/>
-        </w:rPr>
-        <w:t>coordinates</w:t>
-      </w:r>
-      <w:proofErr w:type="gramEnd"/>
-      <w:r>
-        <w:rPr>
-          <w:sz w:val="22"/>
-          <w:szCs w:val="22"/>
-        </w:rPr>
-        <w:t xml:space="preserve"> it reaches 0.801, matching NYC’s in-city 0.802. Combined </w:t>
-      </w:r>
-      <w:proofErr w:type="spellStart"/>
-      <w:r>
-        <w:rPr>
-          <w:sz w:val="22"/>
-          <w:szCs w:val="22"/>
-        </w:rPr>
-        <w:t>NYC+Paris</w:t>
-      </w:r>
-      <w:proofErr w:type="spellEnd"/>
-      <w:r>
-        <w:rPr>
-          <w:sz w:val="22"/>
-          <w:szCs w:val="22"/>
-        </w:rPr>
-        <w:t xml:space="preserve"> training with raw coordinates scores highest uncalibrated (0.822), which we suspect (not proven) is because raw coordinates let the network infer a city-level price level.</w:t>
+        <w:t xml:space="preserve"> Berlin Spearman is 0.79–0.88 for the non-diverged variants, close to in-city values, while the bias reflects city price levels (NYC-trained relative-coordinate model over-predicts Berlin by about 0.80 log units, roughly 2.2×). Calibrating with only 100 Berlin listings lifts R² to 0.71–0.84; for NYC to Berlin with relative coordinates it reaches 0.801, matching NYC’s in-city 0.802. Combined NYC+Paris training with raw coordinates scores highest uncalibrated (0.822), which we suspect (not proven) is because raw coordinates let the network infer a city-level price level.</w:t>
       </w:r>
     </w:p>
     <w:p>
@@ -5883,6 +5338,7 @@
   <w:style w:type="character" w:default="1" w:styleId="DefaultParagraphFont">
     <w:name w:val="Default Paragraph Font"/>
     <w:uiPriority w:val="1"/>
+    <w:semiHidden/>
     <w:unhideWhenUsed/>
   </w:style>
   <w:style w:type="table" w:default="1" w:styleId="TableNormal">

</xml_diff>

<commit_message>
Update report with scrape dates and fix README
</commit_message>
<xml_diff>
--- a/docs/report.docx
+++ b/docs/report.docx
@@ -268,35 +268,21 @@
           <w:sz w:val="22"/>
           <w:szCs w:val="22"/>
         </w:rPr>
-        <w:t xml:space="preserve"> listing tables for New York City, Paris and Berlin (snapshot </w:t>
-      </w:r>
-      <w:r>
-        <w:rPr>
-          <w:sz w:val="22"/>
-          <w:szCs w:val="22"/>
-        </w:rPr>
-        <w:t>23</w:t>
-      </w:r>
-      <w:r>
-        <w:rPr>
-          <w:sz w:val="22"/>
-          <w:szCs w:val="22"/>
-        </w:rPr>
-        <w:t>-</w:t>
-      </w:r>
-      <w:r>
-        <w:rPr>
-          <w:sz w:val="22"/>
-          <w:szCs w:val="22"/>
-        </w:rPr>
-        <w:t>06</w:t>
-      </w:r>
-      <w:r>
-        <w:rPr>
-          <w:sz w:val="22"/>
-          <w:szCs w:val="22"/>
-        </w:rPr>
-        <w:t xml:space="preserve">-2026; 90 columns). Raw rows: NYC 30,259, Paris 77,679, Berlin 12,776. After removing listings with a missing or zero price and those above $500/night, </w:t>
+        <w:t xml:space="preserve"> listing tables for New York City, Paris and Berlin (</w:t>
+      </w:r>
+      <w:r>
+        <w:rPr>
+          <w:sz w:val="22"/>
+          <w:szCs w:val="22"/>
+        </w:rPr>
+        <w:t>scrapped 14 June to 3 July 2026</w:t>
+      </w:r>
+      <w:r>
+        <w:rPr>
+          <w:sz w:val="22"/>
+          <w:szCs w:val="22"/>
+        </w:rPr>
+        <w:t xml:space="preserve">; 90 columns). Raw rows: NYC 30,259, Paris 77,679, Berlin 12,776. After removing listings with a missing or zero price and those above $500/night, </w:t>
       </w:r>
       <w:r>
         <w:rPr>
@@ -5338,7 +5324,6 @@
   <w:style w:type="character" w:default="1" w:styleId="DefaultParagraphFont">
     <w:name w:val="Default Paragraph Font"/>
     <w:uiPriority w:val="1"/>
-    <w:semiHidden/>
     <w:unhideWhenUsed/>
   </w:style>
   <w:style w:type="table" w:default="1" w:styleId="TableNormal">

</xml_diff>